<commit_message>
Update CV and CareerAgent project with latest progress
- CareerAgent: profile page, Playwright E2E tests, Claude Code hooks and code-review agent
- Regenerate Hebrew and English CV files (PDF, Word) and the text used by the AI feature
</commit_message>
<xml_diff>
--- a/client/public/cv/talia-english.docx
+++ b/client/public/cv/talia-english.docx
@@ -400,43 +400,61 @@
           <w:sz w:val="20"/>
           <w:szCs w:val="20"/>
         </w:rPr>
-        <w:t xml:space="preserve">Building an AI-powered job-search assistant as a TypeScript monorepo: NestJS REST API, Next.js frontend and shared types.</w:t>
-      </w:r>
-    </w:p>
-    <w:p>
-      <w:pPr>
-        <w:pStyle w:val="ListParagraph"/>
-        <w:numPr>
-          <w:ilvl w:val="0"/>
-          <w:numId w:val="2"/>
-        </w:numPr>
-        <w:spacing w:after="40"/>
-      </w:pPr>
-      <w:r>
-        <w:rPr>
-          <w:rFonts w:ascii="Calibri" w:cs="Calibri" w:eastAsia="Calibri" w:hAnsi="Calibri"/>
-          <w:sz w:val="20"/>
-          <w:szCs w:val="20"/>
-        </w:rPr>
-        <w:t xml:space="preserve">Implemented JWT authentication with bcrypt password hashing and user-scoped job data using Prisma and PostgreSQL with versioned migrations.</w:t>
-      </w:r>
-    </w:p>
-    <w:p>
-      <w:pPr>
-        <w:pStyle w:val="ListParagraph"/>
-        <w:numPr>
-          <w:ilvl w:val="0"/>
-          <w:numId w:val="2"/>
-        </w:numPr>
-        <w:spacing w:after="40"/>
-      </w:pPr>
-      <w:r>
-        <w:rPr>
-          <w:rFonts w:ascii="Calibri" w:cs="Calibri" w:eastAsia="Calibri" w:hAnsi="Calibri"/>
-          <w:sz w:val="20"/>
-          <w:szCs w:val="20"/>
-        </w:rPr>
-        <w:t xml:space="preserve">Wrote unit and end-to-end tests running against an isolated test database; next step is AI-based job-to-CV match scoring.</w:t>
+        <w:t xml:space="preserve">Building an AI job-search assistant as a TypeScript monorepo: NestJS REST API, Next.js frontend and shared types.</w:t>
+      </w:r>
+    </w:p>
+    <w:p>
+      <w:pPr>
+        <w:pStyle w:val="ListParagraph"/>
+        <w:numPr>
+          <w:ilvl w:val="0"/>
+          <w:numId w:val="2"/>
+        </w:numPr>
+        <w:spacing w:after="40"/>
+      </w:pPr>
+      <w:r>
+        <w:rPr>
+          <w:rFonts w:ascii="Calibri" w:cs="Calibri" w:eastAsia="Calibri" w:hAnsi="Calibri"/>
+          <w:sz w:val="20"/>
+          <w:szCs w:val="20"/>
+        </w:rPr>
+        <w:t xml:space="preserve">Implemented JWT auth and user-scoped jobs and CV profile data with Prisma, PostgreSQL and versioned migrations.</w:t>
+      </w:r>
+    </w:p>
+    <w:p>
+      <w:pPr>
+        <w:pStyle w:val="ListParagraph"/>
+        <w:numPr>
+          <w:ilvl w:val="0"/>
+          <w:numId w:val="2"/>
+        </w:numPr>
+        <w:spacing w:after="40"/>
+      </w:pPr>
+      <w:r>
+        <w:rPr>
+          <w:rFonts w:ascii="Calibri" w:cs="Calibri" w:eastAsia="Calibri" w:hAnsi="Calibri"/>
+          <w:sz w:val="20"/>
+          <w:szCs w:val="20"/>
+        </w:rPr>
+        <w:t xml:space="preserve">Wrote unit tests and 19 Playwright E2E tests on an isolated test DB; next step is AI job-to-CV match scoring.</w:t>
+      </w:r>
+    </w:p>
+    <w:p>
+      <w:pPr>
+        <w:pStyle w:val="ListParagraph"/>
+        <w:numPr>
+          <w:ilvl w:val="0"/>
+          <w:numId w:val="2"/>
+        </w:numPr>
+        <w:spacing w:after="40"/>
+      </w:pPr>
+      <w:r>
+        <w:rPr>
+          <w:rFonts w:ascii="Calibri" w:cs="Calibri" w:eastAsia="Calibri" w:hAnsi="Calibri"/>
+          <w:sz w:val="20"/>
+          <w:szCs w:val="20"/>
+        </w:rPr>
+        <w:t xml:space="preserve">AI-assisted workflow with Claude Code: CLAUDE.md, hooks guarding secrets and running type checks, and a code-review agent.</w:t>
       </w:r>
     </w:p>
     <w:p>

</xml_diff>